<commit_message>
Draft_110_body: expound Hedging in L2 and EFL Contexts
Expand each study with design and findings. Add Alonso (2019)
multicompetence, Mazidah et al. (2022) undergraduate abstracts,
and Loi and Lim (2015) pedagogical informant views. Closing
baseline sentence retained. Other sections untouched.
</commit_message>
<xml_diff>
--- a/thesis/003_ThesisProposal_Draft_110_body.docx
+++ b/thesis/003_ThesisProposal_Draft_110_body.docx
@@ -820,10 +820,9 @@
       </w:pPr>
       <w:r>
         <w:rPr>
-          <w:rFonts w:ascii="Georgia" w:hAnsi="Georgia" w:eastAsia="Georgia"/>
-          <w:sz w:val="22"/>
-        </w:rPr>
-        <w:t>English is the medium of academic writing at PSAU, but not the home language for most students. Research on second-language academic writing has long treated hedging as a point of difficulty rather than as a simple vocabulary gap. Hyland and Milton (1997) compared expressions of doubt and certainty in a one-million-word corpus of examination scripts from 900 Cantonese-speaking school leavers writing in English and 770 British learners of similar age and educational level. The L2 writers relied on a more limited range of epistemic items, offered stronger commitments, and had greater difficulty conveying a precise degree of certainty than their L1 peers. That pattern set the baseline still cited across EFL research: L2 academic writers often under-qualify claims or overuse a small set of strong forms.</w:t>
+          <w:rFonts w:ascii="Georgia" w:hAnsi="Georgia" w:cs="Georgia"/>
+        </w:rPr>
+        <w:t>English is the medium of academic writing at PSAU, but it is not the home language for most students. Research on second-language academic writing has long treated hedging as a point of difficulty rather than as a simple vocabulary gap. Hyland and Milton (1997) compared expressions of doubt and certainty in a one-million-word corpus of examination scripts from 900 Cantonese-speaking school leavers writing in English and 770 British learners of similar age and educational level. The L2 writers relied on a more limited range of epistemic items, offered stronger commitments, and showed greater difficulty conveying a precise degree of certainty than their L1 peers. That pattern remains a baseline across EFL research. L2 academic writers often under-qualify claims or overuse a small set of strong forms.</w:t>
       </w:r>
     </w:p>
     <w:p>
@@ -834,10 +833,9 @@
       </w:pPr>
       <w:r>
         <w:rPr>
-          <w:rFonts w:ascii="Georgia" w:hAnsi="Georgia" w:eastAsia="Georgia"/>
-          <w:sz w:val="22"/>
-        </w:rPr>
-        <w:t>Hinkel (2005) sharpens the formal picture with a large student-essay corpus (745 essays, about 221,000 words). Non-native writers used a severely limited range of hedging devices, many of them associated with conversational rather than formal written discourse. The same essays showed a prevalence of conversational intensifiers and overstatements that are common in informal speech but rare in academic prose. Demir (2018) compared lexical hedges in academic texts by native and non-native writers of English and reported significant differences across modal, verbal, adjectival, adverbial, quantifier, and noun hedges, as well as in total hedge use. Taken together, these studies show that the L2 issue is not only density. It is range, register, and the balance between caution and overstatement.</w:t>
+          <w:rFonts w:ascii="Georgia" w:hAnsi="Georgia" w:cs="Georgia"/>
+        </w:rPr>
+        <w:t>Hinkel (2005) sharpens the formal picture with a large student-essay corpus of 745 essays and about 221,000 words. Non-native writers used a severely limited range of hedging devices, many of them associated with conversational rather than formal written discourse. The same essays showed a prevalence of conversational intensifiers and overstatements that are common in informal speech but rare in academic prose. Demir (2018) compared lexical hedges in academic texts by native and non-native writers of English and reported significant differences across modal, verbal, adjectival, adverbial, quantifier, and noun hedges, as well as in total hedge use. Taken together, these studies show that the L2 issue is not only density. It is range, register, and the balance between caution and overstatement.</w:t>
       </w:r>
     </w:p>
     <w:p>
@@ -848,10 +846,9 @@
       </w:pPr>
       <w:r>
         <w:rPr>
-          <w:rFonts w:ascii="Georgia" w:hAnsi="Georgia" w:eastAsia="Georgia"/>
-          <w:sz w:val="22"/>
-        </w:rPr>
-        <w:t>Takimoto (2015) adds a recognition layer. In a corpus comparison of academic essays by Japanese EFL learners and native speakers of English, the EFL group used more boosters than hedges and preferred straightforward, explicit expressions, whereas native writers were more tentative. A follow-up task suggested that certainty items were more visible to the learners than possibility and probability items, which they often misapprehended. Underuse of hedges can therefore coexist with limited pragmatic awareness of what the missing forms do. Luo (2021) reaches a similar aggregate conclusion in a systematic review of undergraduate English language learners’ hedging: ELLs generally use fewer hedges than native speakers, draw on a narrower inventory, and face combined challenges of academic experience and L2 form control.</w:t>
+          <w:rFonts w:ascii="Georgia" w:hAnsi="Georgia" w:cs="Georgia"/>
+        </w:rPr>
+        <w:t>Takimoto (2015) adds a recognition layer. In a corpus comparison of academic essays by Japanese EFL learners and native speakers of English, the EFL group used more boosters than hedges and preferred straightforward, explicit expressions, whereas native writers were more tentative. A follow-up task suggested that certainty items were more visible to the learners than possibility and probability items, which they often misapprehended. Underuse of hedges can therefore coexist with limited pragmatic awareness of what the missing forms do. Luo (2021), in a systematic review of undergraduate English language learners' hedging, reaches a similar aggregate conclusion. ELLs generally use fewer hedges than native speakers, draw on a narrower inventory, and face combined challenges of academic experience and L2 form control.</w:t>
       </w:r>
     </w:p>
     <w:p>
@@ -862,10 +859,9 @@
       </w:pPr>
       <w:r>
         <w:rPr>
-          <w:rFonts w:ascii="Georgia" w:hAnsi="Georgia" w:eastAsia="Georgia"/>
-          <w:sz w:val="22"/>
-        </w:rPr>
-        <w:t>Publication medium and cultural writing tradition can widen the same gap. Hu and Cao (2011) found that applied-linguistics abstracts in English-medium journals carried markedly more hedges than those in Chinese-medium journals, a difference they link jointly to rhetorical convention and epistemological belief. Halabisaz et al. (2014), already noted for thesis abstracts, attributed native–non-native differences in applied-linguistics master’s abstracts to rhetorical sensitivity and cultural background as well as to form. Ghia et al. (2022) showed that advanced Italian EFL undergraduates writing English thesis abstracts still used fewer hedges and more boosters and certainty modals than L1 student writing in MICUSP, even while displaying partial awareness of academic caution.</w:t>
+          <w:rFonts w:ascii="Georgia" w:hAnsi="Georgia" w:cs="Georgia"/>
+        </w:rPr>
+        <w:t>Alonso (2019) approaches the same problem through a multicompetence design rather than an L2-only comparison. She examined hedges in academic writing by 24 Spanish learners of English, collecting data from the same participants in both Spanish and English, and compared them with monolingual Spanish and monolingual English control groups of 24 speakers each. Hedges were coded following Hyland's (1994) typology. Chi-square analyses showed differences between English and Spanish speakers, and between English speakers and L2 learners, especially in impersonal expressions and lexical verbs. Evidence of crosslinguistic influence appeared, and similarity in the use of adverbs across the learners' L1 and L2 pointed to L1-L2 convergence. The design matters for the present study because it shows that L2 hedging patterns cannot be read as a pure deficit against native English norms without also considering the writer's full language system. Publication medium and cultural writing tradition can widen the same gap. Hu and Cao (2011) found that applied-linguistics abstracts in English-medium journals carried markedly more hedges than those in Chinese-medium journals, a difference they link jointly to rhetorical convention and epistemological belief. Halabisaz et al. (2014) attributed native-non-native differences in applied-linguistics master's abstracts to rhetorical sensitivity and cultural background as well as to form.</w:t>
       </w:r>
     </w:p>
     <w:p>
@@ -876,10 +872,9 @@
       </w:pPr>
       <w:r>
         <w:rPr>
-          <w:rFonts w:ascii="Georgia" w:hAnsi="Georgia" w:eastAsia="Georgia"/>
-          <w:sz w:val="22"/>
-        </w:rPr>
-        <w:t>Instruction and regional student populations push the same themes into classroom-facing research. Petchkij (2019) argues that explicit teaching of hedges can raise their use in Thai EFL contexts, though modal forms often remain dominant. Ningrum et al. (2024) examine hedges and boosters in the academic writing of ASEAN EFL learners and document limited inventories under regional L2 conditions. Lopez et al. (2025) and Escalona (2025) extend the Philippine and college-essay evidence on caution, certainty, and proficiency-related patterns in student writing. Bayraktar-Çepni and Kulaksız (2022) compare hedging in discussion sections of ELT MA and PhD theses and find that MA theses contained significantly more hedges than PhD theses, a difference they link to developing writers’ stronger need to soften stance. Level of academic experience, not only L1 versus L2 status, therefore shapes how much caution writers encode.</w:t>
+          <w:rFonts w:ascii="Georgia" w:hAnsi="Georgia" w:cs="Georgia"/>
+        </w:rPr>
+        <w:t>Undergraduate thesis abstracts, the genre closest to the present corpus, show the same L2 pressures. Mazidah et al. (2022) compared hedges and boosters in 50 undergraduate thesis abstracts from English Language Education and Mathematics students at an Indonesian university, using Hyland's (2005) taxonomy. Boosters outnumbered hedges overall, and the authors link heavy booster use and limited hedge variety to incomplete knowledge of English academic rhetoric. Ghia et al. (2022) examined 217 English thesis abstracts by advanced Italian EFL undergraduates and compared them with L1 student writing in MICUSP. The EFL writers used fewer hedges and more boosters and certainty modals than the L1 comparison group, even while displaying partial awareness of academic caution. Bayraktar-Cepni and Kulaksiz (2022) compared hedging in discussion sections of ELT MA and PhD theses and found that MA theses contained significantly more hedges than PhD theses, a difference they link to developing writers' stronger need to soften stance. Level of academic experience, not only L1 versus L2 status, therefore shapes how much caution writers encode.</w:t>
       </w:r>
     </w:p>
     <w:p>
@@ -890,10 +885,9 @@
       </w:pPr>
       <w:r>
         <w:rPr>
-          <w:rFonts w:ascii="Georgia" w:hAnsi="Georgia" w:eastAsia="Georgia"/>
-          <w:sz w:val="22"/>
-        </w:rPr>
-        <w:t>Since the present study does not measure English proficiency independently, observed patterns in the PSAU corpus may reflect L2 constraints, disciplinary socialization, instructional history, or some combination of these. The aim is a descriptive baseline of how stance is worded in ratified undergraduate thesis abstracts, not a test of which single factor causes the pattern.</w:t>
+          <w:rFonts w:ascii="Georgia" w:hAnsi="Georgia" w:cs="Georgia"/>
+        </w:rPr>
+        <w:t>Instructional research points in the same direction. Petchkij (2019) argues that explicit teaching of hedges can raise their use in Thai EFL contexts, though modal forms often remain dominant. Loi and Lim (2015) analysed hedging orientations in discussion sections from the Journal of English for Academic Purposes and elicited specialist-informant views on L2 difficulty. Informants attributed second-language learners' inability to modulate claims to socio-cultural factors, classroom instruction, disciplinary culture, and disciplinary appeals, and stressed that pragmatic fluency in hedging is teachable rather than automatic. Ningrum et al. (2024) document limited hedge inventories and a preference for boosters among ASEAN EFL learners writing academic texts. Lopez et al. (2025) and Escalona (2025) extend the Philippine and college-essay evidence on caution, certainty, and proficiency-related patterns in student writing. Since the present study does not measure English proficiency independently, observed patterns in the PSAU corpus may reflect L2 constraints, disciplinary socialization, instructional history, or some combination of these. The aim is a descriptive baseline of how stance is worded in ratified undergraduate thesis abstracts, not a test of which single factor causes the pattern.</w:t>
       </w:r>
     </w:p>
     <w:p>

</xml_diff>

<commit_message>
Draft_110_body: expound Hedging in Philippine Academic Writing Contexts
Expand with Ningrum, Lopez, Escalona, Luyun, Melon-Galvez,
Magday et al., Gamad et al., Villanueva, and Grengia.
Genre caveat and applied-life-sciences abstract gap retained.
Nisa not in references (Indonesian, unrelated). Other sections untouched.
</commit_message>
<xml_diff>
--- a/thesis/003_ThesisProposal_Draft_110_body.docx
+++ b/thesis/003_ThesisProposal_Draft_110_body.docx
@@ -925,9 +925,65 @@
       </w:pPr>
       <w:r>
         <w:rPr>
-          <w:rtl w:val="0"/>
-        </w:rPr>
-        <w:t>Philippine and regional findings align with this picture. Ningrum et al. (2024) report that ASEAN learner data, including Philippine samples, show a preference for boosters over hedges and overuse of intensifiers such as completely, really, and always. Escalona (2025) and Lopez et al. (2025), in local college essay studies, find developing-stage proficiency with epistemic modals dominant and only modest differences by major field. Those studies examine essays rather than thesis abstracts, so they cannot be read as direct predictions for the present corpus. They do show that Philippine L2 academic English often leans on a small modal set and on intensifying rather than softening moves. Outside the student essay genre, Villanueva (2014) shows hedging used to manage accountability in Philippine newspaper editorials. Different genre, same point: hedging is context-sensitive rather than a fixed national style.</w:t>
+          <w:rFonts w:ascii="Georgia" w:hAnsi="Georgia" w:cs="Georgia"/>
+        </w:rPr>
+        <w:t>Philippine and regional findings align with the broader L2 picture while adding local detail. Ningrum et al. (2024) analysed academic writing from the ICNALE learner corpus across ten ASEAN contexts, including the Philippines. ASEAN EFL learners preferred boosters over hedges. Overused boosters included completely, really, and always, while the most frequent hedges included usually, often, and maybe. The pattern suggests that regional learners often encode confidence more readily than caution in academic prose.</w:t>
+      </w:r>
+    </w:p>
+    <w:p>
+      <w:pPr>
+        <w:spacing w:after="0" w:before="0" w:line="480" w:lineRule="auto"/>
+        <w:ind w:firstLine="720"/>
+        <w:jc w:val="both"/>
+        <w:rPr/>
+      </w:pPr>
+      <w:r>
+        <w:rPr>
+          <w:rFonts w:ascii="Georgia" w:hAnsi="Georgia" w:cs="Georgia"/>
+        </w:rPr>
+        <w:t xml:space="preserve">Local college essay studies point in the same direction. Lopez et al. (2025) examined 50 argumentative essays by English Language Studies majors at a northern Philippine state university. Students showed developing-stage control of hedges and boosters, with epistemic modal verbs the most frequent forms across proficiency levels. Escalona (2025) compared hedges and boosters in essays by AB-English and BS-Information Technology students and found that female writers used hedges more often than male writers, while overall frequencies remained relatively consistent across major fields. Both studies examine essays rather than thesis abstracts, so they cannot be read as direct predictions for the present corpus. They do show that Philippine undergraduate academic English often leans on a small modal set and mixes intensifying moves with limited softening.</w:t>
+      </w:r>
+    </w:p>
+    <w:p>
+      <w:pPr>
+        <w:spacing w:after="0" w:before="0" w:line="480" w:lineRule="auto"/>
+        <w:ind w:firstLine="720"/>
+        <w:jc w:val="both"/>
+        <w:rPr/>
+      </w:pPr>
+      <w:r>
+        <w:rPr>
+          <w:rFonts w:ascii="Georgia" w:hAnsi="Georgia" w:cs="Georgia"/>
+        </w:rPr>
+        <w:t xml:space="preserve">Research on Philippine student research writing brings the evidence closer to the thesis genre. Luyun (2024) analysed introduction and conclusion sections in 41 undergraduate research papers from BSED and BEED programs at a Philippine university, using Mojica's hedge categories and Hyland's booster taxonomy. The most frequent hedge forms included this study, it, and the study, with may also appearing among Type I devices. The dominant booster was should. No significant difference in hedge or booster frequency emerged between the two education programs. Melon-Galvez (2017) examined the hedging system of Filipino engineering students writing technical ESP texts and linked hedge use to framing, intertextuality, and task type, with pedagogical implications for precision and interpersonal stance in technical discourse.</w:t>
+      </w:r>
+    </w:p>
+    <w:p>
+      <w:pPr>
+        <w:spacing w:after="0" w:before="0" w:line="480" w:lineRule="auto"/>
+        <w:ind w:firstLine="720"/>
+        <w:jc w:val="both"/>
+        <w:rPr/>
+      </w:pPr>
+      <w:r>
+        <w:rPr>
+          <w:rFonts w:ascii="Georgia" w:hAnsi="Georgia" w:cs="Georgia"/>
+        </w:rPr>
+        <w:t xml:space="preserve">Published research articles written in Philippine English add a professional layer. Magday et al. (2026) compared hedges in the Results and Discussion sections of 70 English Language Teaching research articles, 35 by Filipino writers and 35 by Thai writers. Filipino writers used hedges at a higher density (23.74 per 1,000 words) than Thai writers (17.63 per 1,000 words). The authors link the difference in part to the Philippines' ESL relationship with English versus Thailand's EFL context, even where disciplinary conventions are shared. Gamad et al. (2024) analysed metadiscourse markers in the Results, Discussion, and Conclusion sections of 90 research articles across social sciences, linguistics, and business in Philippine English, American English, and Chinese English. Hedges were the most frequent interactional markers overall, and Philippine English research articles showed comparatively high metadiscourse use, with interactional preferences varying by discipline.</w:t>
+      </w:r>
+    </w:p>
+    <w:p>
+      <w:pPr>
+        <w:spacing w:after="0" w:before="0" w:line="480" w:lineRule="auto"/>
+        <w:ind w:firstLine="720"/>
+        <w:jc w:val="both"/>
+        <w:rPr/>
+      </w:pPr>
+      <w:r>
+        <w:rPr>
+          <w:rFonts w:ascii="Georgia" w:hAnsi="Georgia" w:cs="Georgia"/>
+        </w:rPr>
+        <w:t xml:space="preserve">Outside student essays and research articles, Philippine editorial writing shows hedging as a context-sensitive resource rather than a fixed national style. Villanueva (2014) examined 30 editorials from three leading Philippine newspapers and found that nearly half of the hedges were references to official reports or authorities, with modals and adverbs making up a little over 30 percent. Those forms helped editors manage accountability and soften claims on politically sensitive topics. Grengia (2025) extended the editorial analysis to student publications, The Philippine Collegian and The LaSallian, and found deliberate but publication-specific hedge use tied to voice, audience, and rhetorical goals. Taken together, the Philippine evidence shows modal-heavy inventories, frequent booster preference in learner writing, and higher hedge density in some professional Filipino ELT research than in comparable EFL contexts. No published study identified in this review has examined hedging in undergraduate thesis abstracts from applied life sciences in a Philippine L2 setting. That gap is the present study's descriptive starting point.</w:t>
       </w:r>
     </w:p>
     <w:p>

</xml_diff>